<commit_message>
Mise a jour template Attestation Domiciliation Initiale
</commit_message>
<xml_diff>
--- a/templates/SARL AU/SARL-AU_2026-03_Attestation-Domiciliation-Initiale_Template.docx
+++ b/templates/SARL AU/SARL-AU_2026-03_Attestation-Domiciliation-Initiale_Template.docx
@@ -8,13 +8,96 @@
       </w:pPr>
       <w:r>
         <w:rPr>
+          <w:sz w:val="22"/>
+          <w:szCs w:val="22"/>
+          <w:lang w:val="fr-FR"/>
+        </w:rPr>
+        <w:t xml:space="preserve">Nous soussignés</w:t>
+      </w:r>
+      <w:r>
+        <w:rPr>
           <w:b/>
           <w:bCs/>
           <w:sz w:val="22"/>
           <w:szCs w:val="22"/>
           <w:lang w:val="fr-FR"/>
         </w:rPr>
-        <w:t xml:space="preserve">ATTESTATION DE DOMICILIATION</w:t>
+        <w:t xml:space="preserve"> CENTRE D’AFFAIRES CENTIRIO SAR</w:t>
+      </w:r>
+      <w:r>
+        <w:rPr>
+          <w:sz w:val="22"/>
+          <w:szCs w:val="22"/>
+          <w:lang w:val="fr-FR"/>
+        </w:rPr>
+        <w:t xml:space="preserve">L sis à </w:t>
+      </w:r>
+      <w:r>
+        <w:rPr>
+          <w:b/>
+          <w:bCs/>
+          <w:sz w:val="22"/>
+          <w:szCs w:val="22"/>
+          <w:lang w:val="fr-FR"/>
+        </w:rPr>
+        <w:t xml:space="preserve">HAY MOULAY ABDELLAH RUE 300 N 152 ETG 2 AIN CHOCK, CASABLANCA</w:t>
+      </w:r>
+      <w:r>
+        <w:rPr>
+          <w:sz w:val="22"/>
+          <w:szCs w:val="22"/>
+          <w:lang w:val="fr-FR"/>
+        </w:rPr>
+        <w:t xml:space="preserve"> -MAROC</w:t>
+      </w:r>
+    </w:p>
+    <w:p>
+      <w:pPr>
+        <w:jc w:val="both"/>
+      </w:pPr>
+      <w:r>
+        <w:rPr>
+          <w:sz w:val="22"/>
+          <w:szCs w:val="22"/>
+          <w:lang w:val="fr-FR"/>
+        </w:rPr>
+        <w:t xml:space="preserve">Déclare par la présente suivant le dahir N°1-18-110 du 2 Joumada I 1440 (09/01/2019) portant promulgation de la loi 89-17 titre VIII modifiant et complétant la loi 15-95 formant le code de commerce, Donner domiciliation à la société </w:t>
+      </w:r>
+      <w:r>
+        <w:rPr>
+          <w:b/>
+          <w:bCs/>
+          <w:sz w:val="22"/>
+          <w:szCs w:val="22"/>
+          <w:lang w:val="fr-FR"/>
+        </w:rPr>
+        <w:t xml:space="preserve">{{ DENOMINATION_SOCIALE }} {{ FORME_JURIDIQUE }}</w:t>
+      </w:r>
+      <w:r>
+        <w:rPr>
+          <w:sz w:val="22"/>
+          <w:szCs w:val="22"/>
+          <w:lang w:val="fr-FR"/>
+        </w:rPr>
+        <w:t xml:space="preserve">, sous l’ICE N°</w:t>
+      </w:r>
+      <w:r>
+        <w:rPr>
+          <w:b/>
+          <w:bCs/>
+          <w:sz w:val="22"/>
+          <w:szCs w:val="22"/>
+          <w:lang w:val="fr-FR"/>
+        </w:rPr>
+        <w:t xml:space="preserve"> {{ NUMERO_ICE }}</w:t>
+      </w:r>
+      <w:r>
+        <w:rPr>
+          <w:sz w:val="22"/>
+          <w:szCs w:val="22"/>
+          <w:lang w:val="fr-FR"/>
+        </w:rPr>
+        <w:t xml:space="preserve"> à l’adresse suivante :</w:t>
       </w:r>
     </w:p>
     <w:p>
@@ -29,7 +112,7 @@
           <w:szCs w:val="22"/>
           <w:lang w:val="fr-FR"/>
         </w:rPr>
-        <w:t xml:space="preserve">({{ CONTRAT_FORME_JURIDIQUE }})</w:t>
+        <w:t xml:space="preserve">HAY MOULAY ABDELLAH RUE 300 N 152 ETG 2 AIN CHOCK, CASABLANCA.</w:t>
       </w:r>
     </w:p>
     <w:p>
@@ -42,7 +125,7 @@
           <w:szCs w:val="22"/>
           <w:lang w:val="fr-FR"/>
         </w:rPr>
-        <w:t xml:space="preserve">Nous soussignés</w:t>
+        <w:t xml:space="preserve">Pour une durée de :</w:t>
       </w:r>
       <w:r>
         <w:rPr>
@@ -52,15 +135,15 @@
           <w:szCs w:val="22"/>
           <w:lang w:val="fr-FR"/>
         </w:rPr>
-        <w:t xml:space="preserve"> CENTRE D’AFFAIRES CENTIRIO SAR</w:t>
-      </w:r>
-      <w:r>
-        <w:rPr>
-          <w:sz w:val="22"/>
-          <w:szCs w:val="22"/>
-          <w:lang w:val="fr-FR"/>
-        </w:rPr>
-        <w:t xml:space="preserve">L sis à </w:t>
+        <w:t xml:space="preserve"> {{ DUREE_CONTRAT_MOIS }}</w:t>
+      </w:r>
+      <w:r>
+        <w:rPr>
+          <w:sz w:val="22"/>
+          <w:szCs w:val="22"/>
+          <w:lang w:val="fr-FR"/>
+        </w:rPr>
+        <w:t xml:space="preserve"> Mois du</w:t>
       </w:r>
       <w:r>
         <w:rPr>
@@ -70,28 +153,33 @@
           <w:szCs w:val="22"/>
           <w:lang w:val="fr-FR"/>
         </w:rPr>
-        <w:t xml:space="preserve">HAY MOULAY ABDELLAH RUE 300 N 152 ETG 2 AIN CHOCK, CASABLANCA</w:t>
-      </w:r>
-      <w:r>
-        <w:rPr>
-          <w:sz w:val="22"/>
-          <w:szCs w:val="22"/>
-          <w:lang w:val="fr-FR"/>
-        </w:rPr>
-        <w:t xml:space="preserve"> -MAROC</w:t>
-      </w:r>
-    </w:p>
-    <w:p>
-      <w:pPr>
-        <w:jc w:val="center"/>
-      </w:pPr>
-      <w:r>
-        <w:rPr>
-          <w:sz w:val="22"/>
-          <w:szCs w:val="22"/>
-          <w:lang w:val="fr-FR"/>
-        </w:rPr>
-        <w:t xml:space="preserve">ICE : 003829326000013 TP : 34011285 IF : 68834734 RC : 705161</w:t>
+        <w:t xml:space="preserve"> {{ DATE_DEBUT_CONTRAT }}</w:t>
+      </w:r>
+      <w:r>
+        <w:rPr>
+          <w:sz w:val="22"/>
+          <w:szCs w:val="22"/>
+          <w:lang w:val="fr-FR"/>
+        </w:rPr>
+        <w:t xml:space="preserve"> au</w:t>
+      </w:r>
+      <w:r>
+        <w:rPr>
+          <w:b/>
+          <w:bCs/>
+          <w:sz w:val="22"/>
+          <w:szCs w:val="22"/>
+          <w:lang w:val="fr-FR"/>
+        </w:rPr>
+        <w:t xml:space="preserve"> {{ DATE_FIN_CONTRAT }}</w:t>
+      </w:r>
+      <w:r>
+        <w:rPr>
+          <w:sz w:val="22"/>
+          <w:szCs w:val="22"/>
+          <w:lang w:val="fr-FR"/>
+        </w:rPr>
+        <w:t xml:space="preserve"> </w:t>
       </w:r>
     </w:p>
     <w:p>
@@ -104,125 +192,7 @@
           <w:szCs w:val="22"/>
           <w:lang w:val="fr-FR"/>
         </w:rPr>
-        <w:t xml:space="preserve">Déclare par la présente suivant le dahir N°1-18-110 du 2 Joumada I 1440 (09/01/2019) portant promulgation de la loi 89-17 titre VIII modifiant et complétant la loi 15-95 formant le code de commerce, Donner domiciliation à la société </w:t>
-      </w:r>
-      <w:r>
-        <w:rPr>
-          <w:b/>
-          <w:bCs/>
-          <w:sz w:val="22"/>
-          <w:szCs w:val="22"/>
-          <w:lang w:val="fr-FR"/>
-        </w:rPr>
-        <w:t xml:space="preserve">{{ DENOMINATION_SOCIALE }} {{ FORME_JURIDIQUE }}</w:t>
-      </w:r>
-      <w:r>
-        <w:rPr>
-          <w:sz w:val="22"/>
-          <w:szCs w:val="22"/>
-          <w:lang w:val="fr-FR"/>
-        </w:rPr>
-        <w:t xml:space="preserve">, sous l’ICE N°</w:t>
-      </w:r>
-      <w:r>
-        <w:rPr>
-          <w:b/>
-          <w:bCs/>
-          <w:sz w:val="22"/>
-          <w:szCs w:val="22"/>
-          <w:lang w:val="fr-FR"/>
-        </w:rPr>
-        <w:t xml:space="preserve"> {{ NUMERO_ICE }}</w:t>
-      </w:r>
-      <w:r>
-        <w:rPr>
-          <w:sz w:val="22"/>
-          <w:szCs w:val="22"/>
-          <w:lang w:val="fr-FR"/>
-        </w:rPr>
-        <w:t xml:space="preserve"> à l’adresse suivante :</w:t>
-      </w:r>
-    </w:p>
-    <w:p>
-      <w:pPr>
-        <w:jc w:val="center"/>
-      </w:pPr>
-      <w:r>
-        <w:rPr>
-          <w:b/>
-          <w:bCs/>
-          <w:sz w:val="22"/>
-          <w:szCs w:val="22"/>
-          <w:lang w:val="fr-FR"/>
-        </w:rPr>
-        <w:t xml:space="preserve">HAY MOULAY ABDELLAH RUE 300 N 152 ETG 2 AIN CHOCK, CASABLANCA.</w:t>
-      </w:r>
-    </w:p>
-    <w:p>
-      <w:pPr>
-        <w:jc w:val="center"/>
-      </w:pPr>
-      <w:r>
-        <w:rPr>
-          <w:sz w:val="22"/>
-          <w:szCs w:val="22"/>
-          <w:lang w:val="fr-FR"/>
-        </w:rPr>
-        <w:t xml:space="preserve">Pour une durée de :</w:t>
-      </w:r>
-      <w:r>
-        <w:rPr>
-          <w:b/>
-          <w:bCs/>
-          <w:sz w:val="22"/>
-          <w:szCs w:val="22"/>
-          <w:lang w:val="fr-FR"/>
-        </w:rPr>
-        <w:t xml:space="preserve"> {{ DUREE_CONTRAT_MOIS }}</w:t>
-      </w:r>
-      <w:r>
-        <w:rPr>
-          <w:sz w:val="22"/>
-          <w:szCs w:val="22"/>
-          <w:lang w:val="fr-FR"/>
-        </w:rPr>
-        <w:t xml:space="preserve"> Mois du</w:t>
-      </w:r>
-      <w:r>
-        <w:rPr>
-          <w:b/>
-          <w:bCs/>
-          <w:sz w:val="22"/>
-          <w:szCs w:val="22"/>
-          <w:lang w:val="fr-FR"/>
-        </w:rPr>
-        <w:t xml:space="preserve"> {{ DATE_DEBUT_CONTRAT }}</w:t>
-      </w:r>
-      <w:r>
-        <w:rPr>
-          <w:sz w:val="22"/>
-          <w:szCs w:val="22"/>
-          <w:lang w:val="fr-FR"/>
-        </w:rPr>
-        <w:t xml:space="preserve"> au</w:t>
-      </w:r>
-      <w:r>
-        <w:rPr>
-          <w:b/>
-          <w:bCs/>
-          <w:sz w:val="22"/>
-          <w:szCs w:val="22"/>
-          <w:lang w:val="fr-FR"/>
-        </w:rPr>
-        <w:t xml:space="preserve"> {{ DATE_FIN_CONTRAT }}</w:t>
-      </w:r>
-      <w:r>
-        <w:rPr>
-          <w:sz w:val="22"/>
-          <w:szCs w:val="22"/>
-          <w:lang w:val="fr-FR"/>
-        </w:rPr>
-        <w:t xml:space="preserve"> </w:t>
+        <w:t xml:space="preserve">Nous déclarons en outre avoir pris connaissance qu’une application des dispositions de l’article 93 du code de recouvrement des créances publiques, les rôles des impôts, état de produit et autres titres de perception régulièrement « mis ont exécutions contre les redevables qui y sont inscrit, toutes autres personnes auprès desquelles les redevables ont élu domicile fiscal, avec leur accord.</w:t>
       </w:r>
     </w:p>
     <w:p>
@@ -235,7 +205,7 @@
           <w:szCs w:val="22"/>
           <w:lang w:val="fr-FR"/>
         </w:rPr>
-        <w:t xml:space="preserve">Nous déclarons en outre avoir pris connaissance qu’une application des dispositions de l’article 93 du code de recouvrement des créances publiques, les rôles des impôts, état de produit et autres titres de perception régulièrement « mis ont exécutions contre les redevables qui y sont inscrit, toutes autres personnes auprès desquelles les redevables ont élu domicile fiscal, avec leur accord.</w:t>
+        <w:t xml:space="preserve">Les personnes auprès desquelles les redevables ont élu domicile fiscal avec leur accord, peuvent, de ce fait, faire l’objet d’action en recouvrement au même titre que les redevables à raison des créances dues au titre de l’activité concerné par la durée de la domiciliation.</w:t>
       </w:r>
     </w:p>
     <w:p>
@@ -248,7 +218,7 @@
           <w:szCs w:val="22"/>
           <w:lang w:val="fr-FR"/>
         </w:rPr>
-        <w:t xml:space="preserve">Les personnes auprès desquelles les redevables ont élu domicile fiscal avec leur accord, peuvent, de ce fait, faire l’objet d’action en recouvrement au même titre que les redevables à raison des créances dues au titre de l’activité concerné par la durée de la domiciliation.</w:t>
+        <w:t xml:space="preserve">Cette attestation est délivrée pour servir et valoir ce que de doit.</w:t>
       </w:r>
     </w:p>
     <w:p>
@@ -261,20 +231,17 @@
           <w:szCs w:val="22"/>
           <w:lang w:val="fr-FR"/>
         </w:rPr>
-        <w:t xml:space="preserve">Cette attestation est délivrée pour servir et valoir ce que de doit.</w:t>
-      </w:r>
-    </w:p>
-    <w:p>
-      <w:pPr>
-        <w:jc w:val="both"/>
-      </w:pPr>
-      <w:r>
-        <w:rPr>
-          <w:sz w:val="22"/>
-          <w:szCs w:val="22"/>
-          <w:lang w:val="fr-FR"/>
-        </w:rPr>
-        <w:t xml:space="preserve">Fait à Casablanca Le : {{ DATE_CONTRAT }}</w:t>
+        <w:t xml:space="preserve">Fait à Casablanca Le : </w:t>
+      </w:r>
+      <w:r>
+        <w:rPr>
+          <w:b/>
+          <w:bCs/>
+          <w:sz w:val="22"/>
+          <w:szCs w:val="22"/>
+          <w:lang w:val="fr-FR"/>
+        </w:rPr>
+        <w:t xml:space="preserve">{{ DATE_CONTRAT }}</w:t>
       </w:r>
     </w:p>
   </w:body>

</xml_diff>

<commit_message>
Ajout pages configuration references + mise a jour template attestation
</commit_message>
<xml_diff>
--- a/templates/SARL AU/SARL-AU_2026-03_Attestation-Domiciliation-Initiale_Template.docx
+++ b/templates/SARL AU/SARL-AU_2026-03_Attestation-Domiciliation-Initiale_Template.docx
@@ -8,6 +8,22 @@
       </w:pPr>
       <w:r>
         <w:rPr>
+          <w:b/>
+          <w:bCs/>
+          <w:sz w:val="36"/>
+          <w:szCs w:val="36"/>
+          <w:color w:val="037711"/>
+          <w:lang w:val="fr-FR"/>
+        </w:rPr>
+        <w:t xml:space="preserve">CENTRE D’AFFAIRES CENTIRIO SARL</w:t>
+      </w:r>
+    </w:p>
+    <w:p>
+      <w:pPr>
+        <w:jc w:val="center"/>
+      </w:pPr>
+      <w:r>
+        <w:rPr>
           <w:sz w:val="22"/>
           <w:szCs w:val="22"/>
           <w:lang w:val="fr-FR"/>
@@ -44,11 +60,23 @@
       </w:r>
       <w:r>
         <w:rPr>
-          <w:sz w:val="22"/>
-          <w:szCs w:val="22"/>
-          <w:lang w:val="fr-FR"/>
-        </w:rPr>
-        <w:t xml:space="preserve"> -MAROC</w:t>
+          <w:b/>
+          <w:bCs/>
+          <w:sz w:val="22"/>
+          <w:szCs w:val="22"/>
+          <w:lang w:val="fr-FR"/>
+        </w:rPr>
+        <w:t xml:space="preserve">-</w:t>
+      </w:r>
+      <w:r>
+        <w:rPr>
+          <w:b/>
+          <w:bCs/>
+          <w:sz w:val="22"/>
+          <w:szCs w:val="22"/>
+          <w:lang w:val="fr-FR"/>
+        </w:rPr>
+        <w:t xml:space="preserve">MAROC</w:t>
       </w:r>
     </w:p>
     <w:p>

</xml_diff>

<commit_message>
fix: PDF generation via Word COM ExportAsFixedFormat + restoration of corrupted attestation template
- Composer dependencies installed (phpword, dompdf) for PDF fallback conversion
- Added require vendor/autoload.php in creation.php and generation.php
- Fixed DocumentRenderer::tryConvertToPdf: SaveAs→ExportAsFixedFormat (COM)
- Restored corrupted SARL AU attestation template from _Racine-Actifs/
  (was stripped of namespaces and drawing elements, causing Word COM to
  reject the file and produce empty 945-byte PDF)
</commit_message>
<xml_diff>
--- a/templates/SARL AU/SARL-AU_2026-03_Attestation-Domiciliation-Initiale_Template.docx
+++ b/templates/SARL AU/SARL-AU_2026-03_Attestation-Domiciliation-Initiale_Template.docx
@@ -1,277 +1,887 @@
 
 <file path=word/document.xml><?xml version="1.0" encoding="utf-8"?>
-<w:document xmlns:w="http://schemas.openxmlformats.org/wordprocessingml/2006/main" xmlns:r="http://schemas.openxmlformats.org/officeDocument/2006/relationships" xmlns:mc="http://schemas.openxmlformats.org/markup-compatibility/2006" mc:Ignorable="w14 wp14">
+<w:document xmlns:wpc="http://schemas.microsoft.com/office/word/2010/wordprocessingCanvas" xmlns:cx="http://schemas.microsoft.com/office/drawing/2014/chartex" xmlns:cx1="http://schemas.microsoft.com/office/drawing/2015/9/8/chartex" xmlns:cx2="http://schemas.microsoft.com/office/drawing/2015/10/21/chartex" xmlns:cx3="http://schemas.microsoft.com/office/drawing/2016/5/9/chartex" xmlns:cx4="http://schemas.microsoft.com/office/drawing/2016/5/10/chartex" xmlns:cx5="http://schemas.microsoft.com/office/drawing/2016/5/11/chartex" xmlns:cx6="http://schemas.microsoft.com/office/drawing/2016/5/12/chartex" xmlns:cx7="http://schemas.microsoft.com/office/drawing/2016/5/13/chartex" xmlns:cx8="http://schemas.microsoft.com/office/drawing/2016/5/14/chartex" xmlns:mc="http://schemas.openxmlformats.org/markup-compatibility/2006" xmlns:aink="http://schemas.microsoft.com/office/drawing/2016/ink" xmlns:am3d="http://schemas.microsoft.com/office/drawing/2017/model3d" xmlns:o="urn:schemas-microsoft-com:office:office" xmlns:oel="http://schemas.microsoft.com/office/2019/extlst" xmlns:r="http://schemas.openxmlformats.org/officeDocument/2006/relationships" xmlns:m="http://schemas.openxmlformats.org/officeDocument/2006/math" xmlns:v="urn:schemas-microsoft-com:vml" xmlns:wp14="http://schemas.microsoft.com/office/word/2010/wordprocessingDrawing" xmlns:wp="http://schemas.openxmlformats.org/drawingml/2006/wordprocessingDrawing" xmlns:w10="urn:schemas-microsoft-com:office:word" xmlns:w="http://schemas.openxmlformats.org/wordprocessingml/2006/main" xmlns:w14="http://schemas.microsoft.com/office/word/2010/wordml" xmlns:w15="http://schemas.microsoft.com/office/word/2012/wordml" xmlns:w16cex="http://schemas.microsoft.com/office/word/2018/wordml/cex" xmlns:w16cid="http://schemas.microsoft.com/office/word/2016/wordml/cid" xmlns:w16="http://schemas.microsoft.com/office/word/2018/wordml" xmlns:w16du="http://schemas.microsoft.com/office/word/2023/wordml/word16du" xmlns:w16sdtdh="http://schemas.microsoft.com/office/word/2020/wordml/sdtdatahash" xmlns:w16sdtfl="http://schemas.microsoft.com/office/word/2024/wordml/sdtformatlock" xmlns:w16se="http://schemas.microsoft.com/office/word/2015/wordml/symex" xmlns:wpg="http://schemas.microsoft.com/office/word/2010/wordprocessingGroup" xmlns:wpi="http://schemas.microsoft.com/office/word/2010/wordprocessingInk" xmlns:wne="http://schemas.microsoft.com/office/word/2006/wordml" xmlns:wps="http://schemas.microsoft.com/office/word/2010/wordprocessingShape" mc:Ignorable="w14 w15 w16se w16cid w16 w16cex w16sdtdh w16sdtfl w16du wp14">
   <w:body>
     <w:p>
       <w:pPr>
+        <w:spacing w:after="0" w:line="240" w:lineRule="auto"/>
+        <w:rPr>
+          <w:rFonts w:ascii="Times New Roman" w:hAnsi="Times New Roman"/>
+          <w:b/>
+          <w:bCs/>
+          <w:color w:val="000000"/>
+          <w:sz w:val="28"/>
+          <w:szCs w:val="28"/>
+          <w:u w:val="double"/>
+          <w:lang w:val="fr-FR"/>
+        </w:rPr>
+      </w:pPr>
+      <w:r>
+        <w:rPr>
+          <w:rFonts w:ascii="Times New Roman" w:hAnsi="Times New Roman"/>
+          <w:b/>
+          <w:bCs/>
+          <w:noProof/>
+          <w:color w:val="000000"/>
+          <w:sz w:val="28"/>
+          <w:szCs w:val="28"/>
+          <w:u w:val="double"/>
+          <w:lang w:val="fr-FR"/>
+          <w14:ligatures w14:val="standardContextual"/>
+        </w:rPr>
+        <w:drawing>
+          <wp:anchor distT="0" distB="0" distL="114300" distR="114300" simplePos="0" relativeHeight="251658240" behindDoc="1" locked="0" layoutInCell="1" allowOverlap="1" wp14:anchorId="00A8EE55" wp14:editId="12A03B40">
+            <wp:simplePos x="0" y="0"/>
+            <wp:positionH relativeFrom="column">
+              <wp:posOffset>2173605</wp:posOffset>
+            </wp:positionH>
+            <wp:positionV relativeFrom="paragraph">
+              <wp:posOffset>230505</wp:posOffset>
+            </wp:positionV>
+            <wp:extent cx="1254760" cy="1254760"/>
+            <wp:effectExtent l="0" t="0" r="2540" b="2540"/>
+            <wp:wrapTopAndBottom/>
+            <wp:docPr id="780628750" name="Graphique 2"/>
+            <wp:cNvGraphicFramePr>
+              <a:graphicFrameLocks xmlns:a="http://schemas.openxmlformats.org/drawingml/2006/main" noChangeAspect="1"/>
+            </wp:cNvGraphicFramePr>
+            <a:graphic xmlns:a="http://schemas.openxmlformats.org/drawingml/2006/main">
+              <a:graphicData uri="http://schemas.openxmlformats.org/drawingml/2006/picture">
+                <pic:pic xmlns:pic="http://schemas.openxmlformats.org/drawingml/2006/picture">
+                  <pic:nvPicPr>
+                    <pic:cNvPr id="780628750" name="Graphique 2"/>
+                    <pic:cNvPicPr/>
+                  </pic:nvPicPr>
+                  <pic:blipFill>
+                    <a:blip r:embed="rId4">
+                      <a:extLst>
+                        <a:ext uri="{96DAC541-7B7A-43D3-8B79-37D633B846F1}">
+                          <asvg:svgBlip xmlns:asvg="http://schemas.microsoft.com/office/drawing/2016/SVG/main" r:embed="rId5"/>
+                        </a:ext>
+                      </a:extLst>
+                    </a:blip>
+                    <a:stretch>
+                      <a:fillRect/>
+                    </a:stretch>
+                  </pic:blipFill>
+                  <pic:spPr>
+                    <a:xfrm>
+                      <a:off x="0" y="0"/>
+                      <a:ext cx="1254760" cy="1254760"/>
+                    </a:xfrm>
+                    <a:prstGeom prst="flowChartAlternateProcess">
+                      <a:avLst/>
+                    </a:prstGeom>
+                  </pic:spPr>
+                </pic:pic>
+              </a:graphicData>
+            </a:graphic>
+            <wp14:sizeRelH relativeFrom="margin">
+              <wp14:pctWidth>0</wp14:pctWidth>
+            </wp14:sizeRelH>
+            <wp14:sizeRelV relativeFrom="margin">
+              <wp14:pctHeight>0</wp14:pctHeight>
+            </wp14:sizeRelV>
+          </wp:anchor>
+        </w:drawing>
+      </w:r>
+    </w:p>
+    <w:p>
+      <w:pPr>
+        <w:spacing w:after="0" w:line="240" w:lineRule="auto"/>
+        <w:rPr>
+          <w:rFonts w:ascii="Times New Roman" w:hAnsi="Times New Roman"/>
+          <w:b/>
+          <w:bCs/>
+          <w:color w:val="000000"/>
+          <w:sz w:val="28"/>
+          <w:szCs w:val="28"/>
+          <w:u w:val="double"/>
+          <w:lang w:val="fr-FR"/>
+        </w:rPr>
+      </w:pPr>
+    </w:p>
+    <w:p>
+      <w:pPr>
+        <w:spacing w:after="0" w:line="240" w:lineRule="auto"/>
         <w:jc w:val="center"/>
-      </w:pPr>
-      <w:r>
-        <w:rPr>
-          <w:b/>
-          <w:bCs/>
-          <w:sz w:val="36"/>
-          <w:szCs w:val="36"/>
-          <w:color w:val="037711"/>
-          <w:lang w:val="fr-FR"/>
-        </w:rPr>
-        <w:t xml:space="preserve">CENTRE D’AFFAIRES CENTIRIO SARL</w:t>
-      </w:r>
-    </w:p>
-    <w:p>
-      <w:pPr>
+        <w:rPr>
+          <w:rFonts w:ascii="Times New Roman" w:hAnsi="Times New Roman"/>
+          <w:b/>
+          <w:bCs/>
+          <w:color w:val="345E0A"/>
+          <w:sz w:val="40"/>
+          <w:szCs w:val="40"/>
+          <w:u w:val="double"/>
+          <w:lang w:val="fr-FR"/>
+        </w:rPr>
+      </w:pPr>
+      <w:r>
+        <w:rPr>
+          <w:rFonts w:ascii="Times New Roman" w:hAnsi="Times New Roman"/>
+          <w:b/>
+          <w:bCs/>
+          <w:color w:val="345E0A"/>
+          <w:sz w:val="40"/>
+          <w:szCs w:val="40"/>
+          <w:u w:val="double"/>
+          <w:lang w:val="fr-FR"/>
+        </w:rPr>
+        <w:t>ATTESTATION DE DOMICILIATION</w:t>
+      </w:r>
+    </w:p>
+    <w:p>
+      <w:pPr>
+        <w:spacing w:after="0" w:line="240" w:lineRule="auto"/>
         <w:jc w:val="center"/>
-      </w:pPr>
-      <w:r>
-        <w:rPr>
-          <w:sz w:val="22"/>
-          <w:szCs w:val="22"/>
-          <w:lang w:val="fr-FR"/>
-        </w:rPr>
-        <w:t xml:space="preserve">Nous soussignés</w:t>
-      </w:r>
-      <w:r>
-        <w:rPr>
-          <w:b/>
-          <w:bCs/>
-          <w:sz w:val="22"/>
-          <w:szCs w:val="22"/>
-          <w:lang w:val="fr-FR"/>
-        </w:rPr>
-        <w:t xml:space="preserve"> CENTRE D’AFFAIRES CENTIRIO SAR</w:t>
-      </w:r>
-      <w:r>
-        <w:rPr>
-          <w:sz w:val="22"/>
-          <w:szCs w:val="22"/>
-          <w:lang w:val="fr-FR"/>
-        </w:rPr>
-        <w:t xml:space="preserve">L sis à </w:t>
-      </w:r>
-      <w:r>
-        <w:rPr>
-          <w:b/>
-          <w:bCs/>
-          <w:sz w:val="22"/>
-          <w:szCs w:val="22"/>
-          <w:lang w:val="fr-FR"/>
-        </w:rPr>
-        <w:t xml:space="preserve">HAY MOULAY ABDELLAH RUE 300 N 152 ETG 2 AIN CHOCK, CASABLANCA</w:t>
-      </w:r>
-      <w:r>
-        <w:rPr>
-          <w:b/>
-          <w:bCs/>
-          <w:sz w:val="22"/>
-          <w:szCs w:val="22"/>
-          <w:lang w:val="fr-FR"/>
-        </w:rPr>
-        <w:t xml:space="preserve">-</w:t>
-      </w:r>
-      <w:r>
-        <w:rPr>
-          <w:b/>
-          <w:bCs/>
-          <w:sz w:val="22"/>
-          <w:szCs w:val="22"/>
-          <w:lang w:val="fr-FR"/>
-        </w:rPr>
-        <w:t xml:space="preserve">MAROC</w:t>
-      </w:r>
-    </w:p>
-    <w:p>
-      <w:pPr>
+        <w:rPr>
+          <w:rFonts w:ascii="Times New Roman" w:hAnsi="Times New Roman"/>
+          <w:b/>
+          <w:bCs/>
+          <w:color w:val="345E0A"/>
+          <w:sz w:val="40"/>
+          <w:szCs w:val="40"/>
+          <w:u w:val="double"/>
+          <w:lang w:val="fr-FR"/>
+        </w:rPr>
+      </w:pPr>
+      <w:r>
+        <w:rPr>
+          <w:rFonts w:ascii="Times New Roman" w:hAnsi="Times New Roman"/>
+          <w:b/>
+          <w:bCs/>
+          <w:color w:val="345E0A"/>
+          <w:sz w:val="40"/>
+          <w:szCs w:val="40"/>
+          <w:u w:val="double"/>
+          <w:lang w:val="fr-FR"/>
+        </w:rPr>
+        <w:t>({{ SOCIETE_FORME_JURIDIQUE }})</w:t>
+      </w:r>
+    </w:p>
+    <w:p>
+      <w:pPr>
+        <w:spacing w:after="0" w:line="240" w:lineRule="auto"/>
         <w:jc w:val="both"/>
-      </w:pPr>
-      <w:r>
-        <w:rPr>
-          <w:sz w:val="22"/>
-          <w:szCs w:val="22"/>
+        <w:rPr>
+          <w:rFonts w:ascii="Times New Roman" w:hAnsi="Times New Roman"/>
+          <w:b/>
+          <w:bCs/>
+          <w:color w:val="000000"/>
+          <w:sz w:val="28"/>
+          <w:szCs w:val="28"/>
+          <w:u w:val="double"/>
+          <w:lang w:val="fr-FR"/>
+        </w:rPr>
+      </w:pPr>
+    </w:p>
+    <w:p>
+      <w:pPr>
+        <w:spacing w:after="0" w:line="240" w:lineRule="auto"/>
+        <w:jc w:val="both"/>
+        <w:rPr>
+          <w:rFonts w:ascii="Times New Roman" w:hAnsi="Times New Roman"/>
+          <w:b/>
+          <w:bCs/>
+          <w:color w:val="000000"/>
+          <w:sz w:val="28"/>
+          <w:szCs w:val="28"/>
+          <w:u w:val="double"/>
+          <w:lang w:val="fr-FR"/>
+        </w:rPr>
+      </w:pPr>
+    </w:p>
+    <w:p>
+      <w:pPr>
+        <w:spacing w:line="240" w:lineRule="auto"/>
+        <w:ind w:firstLine="720"/>
+        <w:jc w:val="both"/>
+        <w:rPr>
+          <w:rFonts w:ascii="Times New Roman" w:hAnsi="Times New Roman"/>
+          <w:sz w:val="24"/>
+          <w:szCs w:val="24"/>
+          <w:lang w:val="fr-FR"/>
+        </w:rPr>
+      </w:pPr>
+      <w:r>
+        <w:rPr>
+          <w:rFonts w:ascii="Times New Roman" w:hAnsi="Times New Roman"/>
+          <w:sz w:val="24"/>
+          <w:szCs w:val="24"/>
+          <w:lang w:val="fr-FR"/>
+        </w:rPr>
+        <w:t xml:space="preserve">Nous soussignés </w:t>
+      </w:r>
+      <w:r>
+        <w:rPr>
+          <w:rFonts w:ascii="Times New Roman" w:hAnsi="Times New Roman"/>
+          <w:b/>
+          <w:bCs/>
+          <w:color w:val="385623" w:themeColor="accent6" w:themeShade="80"/>
+          <w:sz w:val="24"/>
+          <w:szCs w:val="24"/>
+          <w:lang w:val="fr-FR"/>
+        </w:rPr>
+        <w:t xml:space="preserve">CENTRE D’AFFAIRES </w:t>
+      </w:r>
+      <w:r>
+        <w:rPr>
+          <w:rFonts w:ascii="Times New Roman" w:hAnsi="Times New Roman"/>
+          <w:b/>
+          <w:bCs/>
+          <w:color w:val="385623" w:themeColor="accent6" w:themeShade="80"/>
+          <w:sz w:val="24"/>
+          <w:szCs w:val="24"/>
+          <w:lang w:val="fr-FR"/>
+        </w:rPr>
+        <w:t>CENTIR</w:t>
+      </w:r>
+      <w:r>
+        <w:rPr>
+          <w:rFonts w:ascii="Times New Roman" w:hAnsi="Times New Roman"/>
+          <w:b/>
+          <w:bCs/>
+          <w:color w:val="385623" w:themeColor="accent6" w:themeShade="80"/>
+          <w:sz w:val="24"/>
+          <w:szCs w:val="24"/>
+          <w:lang w:val="fr-FR"/>
+        </w:rPr>
+        <w:t>I</w:t>
+      </w:r>
+      <w:r>
+        <w:rPr>
+          <w:rFonts w:ascii="Times New Roman" w:hAnsi="Times New Roman"/>
+          <w:b/>
+          <w:bCs/>
+          <w:color w:val="385623" w:themeColor="accent6" w:themeShade="80"/>
+          <w:sz w:val="24"/>
+          <w:szCs w:val="24"/>
+          <w:lang w:val="fr-FR"/>
+        </w:rPr>
+        <w:t>O</w:t>
+      </w:r>
+      <w:r>
+        <w:rPr>
+          <w:rFonts w:ascii="Times New Roman" w:hAnsi="Times New Roman"/>
+          <w:b/>
+          <w:bCs/>
+          <w:color w:val="385623" w:themeColor="accent6" w:themeShade="80"/>
+          <w:sz w:val="24"/>
+          <w:szCs w:val="24"/>
+          <w:lang w:val="fr-FR"/>
+        </w:rPr>
+        <w:t xml:space="preserve"> SARL</w:t>
+      </w:r>
+      <w:r>
+        <w:rPr>
+          <w:rFonts w:ascii="Times New Roman" w:hAnsi="Times New Roman"/>
+          <w:sz w:val="20"/>
+          <w:szCs w:val="20"/>
+          <w:lang w:val="fr-FR"/>
+        </w:rPr>
+        <w:t xml:space="preserve"> </w:t>
+      </w:r>
+      <w:r>
+        <w:rPr>
+          <w:rFonts w:ascii="Times New Roman" w:hAnsi="Times New Roman"/>
+          <w:sz w:val="24"/>
+          <w:szCs w:val="24"/>
+          <w:lang w:val="fr-FR"/>
+        </w:rPr>
+        <w:t xml:space="preserve">sis à </w:t>
+      </w:r>
+      <w:r>
+        <w:rPr>
+          <w:rFonts w:ascii="Times New Roman" w:hAnsi="Times New Roman"/>
+          <w:sz w:val="24"/>
+          <w:szCs w:val="24"/>
+          <w:lang w:val="fr-FR"/>
+        </w:rPr>
+        <w:t xml:space="preserve">HAY MOULAY ABDELLAH RUE 300 N 152 ETG 2 AIN CHOCK, CASABLANCA </w:t>
+      </w:r>
+      <w:r>
+        <w:rPr>
+          <w:rFonts w:ascii="Times New Roman" w:hAnsi="Times New Roman"/>
+          <w:sz w:val="24"/>
+          <w:szCs w:val="24"/>
+          <w:lang w:val="fr-FR"/>
+        </w:rPr>
+        <w:t>-MAROC</w:t>
+      </w:r>
+    </w:p>
+    <w:p>
+      <w:pPr>
+        <w:spacing w:line="240" w:lineRule="auto"/>
+        <w:jc w:val="center"/>
+        <w:rPr>
+          <w:rFonts w:ascii="Times New Roman" w:hAnsi="Times New Roman"/>
+          <w:b/>
+          <w:bCs/>
+          <w:color w:val="385623" w:themeColor="accent6" w:themeShade="80"/>
+          <w:sz w:val="24"/>
+          <w:szCs w:val="24"/>
+        </w:rPr>
+      </w:pPr>
+      <w:proofErr w:type="gramStart"/>
+      <w:r>
+        <w:rPr>
+          <w:rFonts w:ascii="Times New Roman" w:hAnsi="Times New Roman"/>
+          <w:b/>
+          <w:bCs/>
+          <w:sz w:val="24"/>
+          <w:szCs w:val="24"/>
+        </w:rPr>
+        <w:t>ICE :</w:t>
+      </w:r>
+      <w:proofErr w:type="gramEnd"/>
+      <w:r>
+        <w:rPr>
+          <w:rFonts w:ascii="Times New Roman" w:hAnsi="Times New Roman"/>
+          <w:b/>
+          <w:bCs/>
+          <w:sz w:val="24"/>
+          <w:szCs w:val="24"/>
+        </w:rPr>
+        <w:t xml:space="preserve"> </w:t>
+      </w:r>
+      <w:r>
+        <w:rPr>
+          <w:rFonts w:ascii="Times New Roman" w:hAnsi="Times New Roman"/>
+          <w:b/>
+          <w:bCs/>
+          <w:color w:val="385623" w:themeColor="accent6" w:themeShade="80"/>
+          <w:sz w:val="24"/>
+          <w:szCs w:val="24"/>
+        </w:rPr>
+        <w:t xml:space="preserve">003829326000013     </w:t>
+      </w:r>
+      <w:proofErr w:type="gramStart"/>
+      <w:r>
+        <w:rPr>
+          <w:rFonts w:ascii="Times New Roman" w:hAnsi="Times New Roman"/>
+          <w:b/>
+          <w:bCs/>
+          <w:sz w:val="24"/>
+          <w:szCs w:val="24"/>
+        </w:rPr>
+        <w:t>TP :</w:t>
+      </w:r>
+      <w:proofErr w:type="gramEnd"/>
+      <w:r>
+        <w:rPr>
+          <w:rFonts w:ascii="Times New Roman" w:hAnsi="Times New Roman"/>
+          <w:b/>
+          <w:bCs/>
+          <w:sz w:val="24"/>
+          <w:szCs w:val="24"/>
+        </w:rPr>
+        <w:t xml:space="preserve"> </w:t>
+      </w:r>
+      <w:r>
+        <w:rPr>
+          <w:rFonts w:ascii="Times New Roman" w:hAnsi="Times New Roman"/>
+          <w:b/>
+          <w:bCs/>
+          <w:color w:val="385623" w:themeColor="accent6" w:themeShade="80"/>
+          <w:sz w:val="24"/>
+          <w:szCs w:val="24"/>
+        </w:rPr>
+        <w:t xml:space="preserve">34011285    </w:t>
+      </w:r>
+      <w:proofErr w:type="gramStart"/>
+      <w:r>
+        <w:rPr>
+          <w:rFonts w:ascii="Times New Roman" w:hAnsi="Times New Roman"/>
+          <w:b/>
+          <w:bCs/>
+          <w:sz w:val="24"/>
+          <w:szCs w:val="24"/>
+        </w:rPr>
+        <w:t>IF :</w:t>
+      </w:r>
+      <w:proofErr w:type="gramEnd"/>
+      <w:r>
+        <w:rPr>
+          <w:rFonts w:ascii="Times New Roman" w:hAnsi="Times New Roman"/>
+          <w:b/>
+          <w:bCs/>
+          <w:sz w:val="24"/>
+          <w:szCs w:val="24"/>
+        </w:rPr>
+        <w:t xml:space="preserve"> </w:t>
+      </w:r>
+      <w:r>
+        <w:rPr>
+          <w:rFonts w:ascii="Times New Roman" w:hAnsi="Times New Roman"/>
+          <w:b/>
+          <w:bCs/>
+          <w:color w:val="385623" w:themeColor="accent6" w:themeShade="80"/>
+          <w:sz w:val="24"/>
+          <w:szCs w:val="24"/>
+        </w:rPr>
+        <w:t>68834734</w:t>
+      </w:r>
+      <w:r>
+        <w:rPr>
+          <w:rFonts w:ascii="Times New Roman" w:hAnsi="Times New Roman"/>
+          <w:b/>
+          <w:bCs/>
+          <w:color w:val="385623" w:themeColor="accent6" w:themeShade="80"/>
+          <w:sz w:val="24"/>
+          <w:szCs w:val="24"/>
+        </w:rPr>
+        <w:tab/>
+      </w:r>
+      <w:r>
+        <w:rPr>
+          <w:rFonts w:ascii="Times New Roman" w:hAnsi="Times New Roman"/>
+          <w:b/>
+          <w:bCs/>
+          <w:color w:val="385623" w:themeColor="accent6" w:themeShade="80"/>
+          <w:sz w:val="24"/>
+          <w:szCs w:val="24"/>
+        </w:rPr>
+        <w:t xml:space="preserve">   </w:t>
+      </w:r>
+      <w:r>
+        <w:rPr>
+          <w:rFonts w:ascii="Times New Roman" w:hAnsi="Times New Roman"/>
+          <w:b/>
+          <w:bCs/>
+          <w:color w:val="385623" w:themeColor="accent6" w:themeShade="80"/>
+          <w:sz w:val="24"/>
+          <w:szCs w:val="24"/>
+        </w:rPr>
+        <w:t xml:space="preserve"> </w:t>
+      </w:r>
+      <w:proofErr w:type="gramStart"/>
+      <w:r>
+        <w:rPr>
+          <w:rFonts w:ascii="Times New Roman" w:hAnsi="Times New Roman"/>
+          <w:b/>
+          <w:bCs/>
+          <w:sz w:val="24"/>
+          <w:szCs w:val="24"/>
+        </w:rPr>
+        <w:t>RC :</w:t>
+      </w:r>
+      <w:proofErr w:type="gramEnd"/>
+      <w:r>
+        <w:rPr>
+          <w:rFonts w:ascii="Times New Roman" w:hAnsi="Times New Roman"/>
+          <w:b/>
+          <w:bCs/>
+          <w:sz w:val="24"/>
+          <w:szCs w:val="24"/>
+        </w:rPr>
+        <w:t xml:space="preserve"> </w:t>
+      </w:r>
+      <w:r>
+        <w:rPr>
+          <w:rFonts w:ascii="Times New Roman" w:hAnsi="Times New Roman"/>
+          <w:b/>
+          <w:bCs/>
+          <w:color w:val="385623" w:themeColor="accent6" w:themeShade="80"/>
+          <w:sz w:val="24"/>
+          <w:szCs w:val="24"/>
+        </w:rPr>
+        <w:t>705161</w:t>
+      </w:r>
+    </w:p>
+    <w:p>
+      <w:pPr>
+        <w:spacing w:line="240" w:lineRule="auto"/>
+        <w:ind w:firstLine="720"/>
+        <w:jc w:val="both"/>
+        <w:rPr>
+          <w:rFonts w:ascii="Times New Roman" w:hAnsi="Times New Roman"/>
+          <w:sz w:val="24"/>
+          <w:szCs w:val="24"/>
+          <w:lang w:val="fr-FR"/>
+        </w:rPr>
+      </w:pPr>
+      <w:r>
+        <w:rPr>
+          <w:rFonts w:ascii="Times New Roman" w:hAnsi="Times New Roman"/>
+          <w:sz w:val="24"/>
+          <w:szCs w:val="24"/>
           <w:lang w:val="fr-FR"/>
         </w:rPr>
         <w:t xml:space="preserve">Déclare par la présente suivant le dahir N°1-18-110 du 2 Joumada I 1440 (09/01/2019) portant promulgation de la loi 89-17 titre VIII modifiant et complétant la loi 15-95 formant le code de commerce, Donner domiciliation à la société </w:t>
       </w:r>
       <w:r>
         <w:rPr>
-          <w:b/>
-          <w:bCs/>
-          <w:sz w:val="22"/>
-          <w:szCs w:val="22"/>
-          <w:lang w:val="fr-FR"/>
-        </w:rPr>
-        <w:t xml:space="preserve">{{ SOCIETE_RAISON_SOCIALE }} {{ SOCIETE_FORME_JURIDIQUE }}</w:t>
-      </w:r>
-      <w:r>
-        <w:rPr>
-          <w:sz w:val="22"/>
-          <w:szCs w:val="22"/>
-          <w:lang w:val="fr-FR"/>
-        </w:rPr>
-        <w:t xml:space="preserve">, sous l’ICE N°</w:t>
-      </w:r>
-      <w:r>
-        <w:rPr>
-          <w:b/>
-          <w:bCs/>
-          <w:sz w:val="22"/>
-          <w:szCs w:val="22"/>
-          <w:lang w:val="fr-FR"/>
-        </w:rPr>
-        <w:t xml:space="preserve"> {{ SOCIETE_ICE }}</w:t>
-      </w:r>
-      <w:r>
-        <w:rPr>
-          <w:sz w:val="22"/>
-          <w:szCs w:val="22"/>
-          <w:lang w:val="fr-FR"/>
-        </w:rPr>
-        <w:t xml:space="preserve"> à l’adresse suivante :</w:t>
-      </w:r>
-    </w:p>
-    <w:p>
-      <w:pPr>
+          <w:rFonts w:ascii="Times New Roman" w:hAnsi="Times New Roman"/>
+          <w:b/>
+          <w:bCs/>
+          <w:color w:val="385623" w:themeColor="accent6" w:themeShade="80"/>
+          <w:sz w:val="28"/>
+          <w:szCs w:val="28"/>
+          <w:lang w:val="fr-FR"/>
+        </w:rPr>
+        <w:t>{{ SOCIETE_RAISON_SOCIALE }} {{ SOCIETE_FORME_JURIDIQUE }}</w:t>
+      </w:r>
+      <w:r>
+        <w:rPr>
+          <w:rFonts w:ascii="Times New Roman" w:hAnsi="Times New Roman"/>
+          <w:b/>
+          <w:bCs/>
+          <w:sz w:val="24"/>
+          <w:szCs w:val="24"/>
+          <w:lang w:val="fr-FR"/>
+        </w:rPr>
+        <w:t xml:space="preserve">, </w:t>
+      </w:r>
+      <w:r>
+        <w:rPr>
+          <w:rFonts w:ascii="Times New Roman" w:hAnsi="Times New Roman"/>
+          <w:sz w:val="24"/>
+          <w:szCs w:val="24"/>
+          <w:lang w:val="fr-FR"/>
+        </w:rPr>
+        <w:t>sous</w:t>
+      </w:r>
+      <w:r>
+        <w:rPr>
+          <w:rFonts w:ascii="Times New Roman" w:hAnsi="Times New Roman"/>
+          <w:b/>
+          <w:bCs/>
+          <w:sz w:val="24"/>
+          <w:szCs w:val="24"/>
+          <w:lang w:val="fr-FR"/>
+        </w:rPr>
+        <w:t xml:space="preserve"> l’</w:t>
+      </w:r>
+      <w:r>
+        <w:rPr>
+          <w:rFonts w:ascii="Times New Roman" w:hAnsi="Times New Roman"/>
+          <w:b/>
+          <w:bCs/>
+          <w:sz w:val="24"/>
+          <w:szCs w:val="24"/>
+          <w:lang w:val="fr-FR"/>
+        </w:rPr>
+        <w:t xml:space="preserve">ICE N° </w:t>
+      </w:r>
+      <w:r>
+        <w:rPr>
+          <w:rFonts w:ascii="Times New Roman" w:hAnsi="Times New Roman"/>
+          <w:b/>
+          <w:color w:val="385623" w:themeColor="accent6" w:themeShade="80"/>
+          <w:sz w:val="24"/>
+          <w:szCs w:val="24"/>
+          <w:lang w:val="fr-FR"/>
+        </w:rPr>
+        <w:t xml:space="preserve">{{ SOCIETE_ICE }} </w:t>
+      </w:r>
+      <w:r>
+        <w:rPr>
+          <w:rFonts w:ascii="Times New Roman" w:hAnsi="Times New Roman"/>
+          <w:sz w:val="24"/>
+          <w:szCs w:val="24"/>
+          <w:lang w:val="fr-FR"/>
+        </w:rPr>
+        <w:t>à l’adresse suivante :</w:t>
+      </w:r>
+    </w:p>
+    <w:p>
+      <w:pPr>
+        <w:spacing w:line="240" w:lineRule="auto"/>
+        <w:ind w:firstLine="720"/>
+        <w:jc w:val="both"/>
+        <w:rPr>
+          <w:rFonts w:ascii="Times New Roman" w:hAnsi="Times New Roman"/>
+          <w:sz w:val="24"/>
+          <w:szCs w:val="24"/>
+          <w:lang w:val="fr-FR"/>
+        </w:rPr>
+      </w:pPr>
+    </w:p>
+    <w:p>
+      <w:pPr>
+        <w:spacing w:line="240" w:lineRule="auto"/>
         <w:jc w:val="center"/>
-      </w:pPr>
-      <w:r>
-        <w:rPr>
-          <w:b/>
-          <w:bCs/>
-          <w:sz w:val="22"/>
-          <w:szCs w:val="22"/>
-          <w:lang w:val="fr-FR"/>
-        </w:rPr>
-        <w:t xml:space="preserve">HAY MOULAY ABDELLAH RUE 300 N 152 ETG 2 AIN CHOCK, CASABLANCA.</w:t>
-      </w:r>
-    </w:p>
-    <w:p>
-      <w:pPr>
+        <w:rPr>
+          <w:rFonts w:ascii="Times New Roman" w:hAnsi="Times New Roman"/>
+          <w:b/>
+          <w:bCs/>
+          <w:color w:val="385623" w:themeColor="accent6" w:themeShade="80"/>
+          <w:sz w:val="32"/>
+          <w:szCs w:val="32"/>
+          <w:lang w:val="fr-FR"/>
+        </w:rPr>
+      </w:pPr>
+      <w:r>
+        <w:rPr>
+          <w:rFonts w:ascii="Times New Roman" w:hAnsi="Times New Roman"/>
+          <w:b/>
+          <w:bCs/>
+          <w:color w:val="385623" w:themeColor="accent6" w:themeShade="80"/>
+          <w:sz w:val="32"/>
+          <w:szCs w:val="32"/>
+          <w:lang w:val="fr-FR"/>
+        </w:rPr>
+        <w:t>HAY MOULAY ABDELLAH RUE 300 N 152 ETG 2 AIN CHOCK, CASABLANCA</w:t>
+      </w:r>
+      <w:r>
+        <w:rPr>
+          <w:rFonts w:ascii="Times New Roman" w:hAnsi="Times New Roman"/>
+          <w:b/>
+          <w:bCs/>
+          <w:color w:val="385623" w:themeColor="accent6" w:themeShade="80"/>
+          <w:sz w:val="32"/>
+          <w:szCs w:val="32"/>
+          <w:lang w:val="fr-FR"/>
+        </w:rPr>
+        <w:t>.</w:t>
+      </w:r>
+    </w:p>
+    <w:p>
+      <w:pPr>
+        <w:spacing w:line="240" w:lineRule="auto"/>
         <w:jc w:val="center"/>
-      </w:pPr>
-      <w:r>
-        <w:rPr>
-          <w:sz w:val="22"/>
-          <w:szCs w:val="22"/>
-          <w:lang w:val="fr-FR"/>
-        </w:rPr>
-        <w:t xml:space="preserve">Pour une durée de :</w:t>
-      </w:r>
-      <w:r>
-        <w:rPr>
-          <w:b/>
-          <w:bCs/>
-          <w:sz w:val="22"/>
-          <w:szCs w:val="22"/>
-          <w:lang w:val="fr-FR"/>
-        </w:rPr>
-        <w:t xml:space="preserve"> {{ CONTRAT_DUREE_MOIS }}</w:t>
-      </w:r>
-      <w:r>
-        <w:rPr>
-          <w:sz w:val="22"/>
-          <w:szCs w:val="22"/>
-          <w:lang w:val="fr-FR"/>
-        </w:rPr>
-        <w:t xml:space="preserve"> Mois du</w:t>
-      </w:r>
-      <w:r>
-        <w:rPr>
-          <w:b/>
-          <w:bCs/>
-          <w:sz w:val="22"/>
-          <w:szCs w:val="22"/>
-          <w:lang w:val="fr-FR"/>
-        </w:rPr>
-        <w:t xml:space="preserve"> {{ CONTRAT_DATE_DEBUT }}</w:t>
-      </w:r>
-      <w:r>
-        <w:rPr>
-          <w:sz w:val="22"/>
-          <w:szCs w:val="22"/>
-          <w:lang w:val="fr-FR"/>
-        </w:rPr>
-        <w:t xml:space="preserve"> au</w:t>
-      </w:r>
-      <w:r>
-        <w:rPr>
-          <w:b/>
-          <w:bCs/>
-          <w:sz w:val="22"/>
-          <w:szCs w:val="22"/>
-          <w:lang w:val="fr-FR"/>
-        </w:rPr>
-        <w:t xml:space="preserve"> {{ CONTRAT_DATE_FIN }}</w:t>
-      </w:r>
-      <w:r>
-        <w:rPr>
-          <w:sz w:val="22"/>
-          <w:szCs w:val="22"/>
-          <w:lang w:val="fr-FR"/>
-        </w:rPr>
-        <w:t xml:space="preserve"> </w:t>
-      </w:r>
-    </w:p>
-    <w:p>
-      <w:pPr>
+        <w:rPr>
+          <w:rFonts w:ascii="Times New Roman" w:hAnsi="Times New Roman"/>
+          <w:b/>
+          <w:bCs/>
+          <w:color w:val="7030A0"/>
+          <w:sz w:val="32"/>
+          <w:szCs w:val="32"/>
+          <w:lang w:val="fr-FR"/>
+        </w:rPr>
+      </w:pPr>
+      <w:r>
+        <w:rPr>
+          <w:rFonts w:ascii="Times New Roman" w:hAnsi="Times New Roman"/>
+          <w:b/>
+          <w:bCs/>
+          <w:sz w:val="32"/>
+          <w:szCs w:val="32"/>
+          <w:lang w:val="fr-FR"/>
+        </w:rPr>
+        <w:t xml:space="preserve">Pour une durée de : </w:t>
+      </w:r>
+      <w:r>
+        <w:rPr>
+          <w:rFonts w:ascii="Times New Roman" w:hAnsi="Times New Roman"/>
+          <w:b/>
+          <w:bCs/>
+          <w:color w:val="385623" w:themeColor="accent6" w:themeShade="80"/>
+          <w:sz w:val="32"/>
+          <w:szCs w:val="32"/>
+          <w:lang w:val="fr-FR"/>
+        </w:rPr>
+        <w:t xml:space="preserve">{{ CONTRAT_DUREE_MOIS }} </w:t>
+      </w:r>
+      <w:r>
+        <w:rPr>
+          <w:rFonts w:ascii="Times New Roman" w:hAnsi="Times New Roman"/>
+          <w:b/>
+          <w:bCs/>
+          <w:sz w:val="32"/>
+          <w:szCs w:val="32"/>
+          <w:lang w:val="fr-FR"/>
+        </w:rPr>
+        <w:t xml:space="preserve">Mois du </w:t>
+      </w:r>
+      <w:r>
+        <w:rPr>
+          <w:rFonts w:ascii="Times New Roman" w:hAnsi="Times New Roman"/>
+          <w:b/>
+          <w:bCs/>
+          <w:color w:val="385623" w:themeColor="accent6" w:themeShade="80"/>
+          <w:sz w:val="32"/>
+          <w:szCs w:val="32"/>
+          <w:lang w:val="fr-FR"/>
+        </w:rPr>
+        <w:t>{{ CONTRAT_DATE_DEBUT }}</w:t>
+      </w:r>
+      <w:r>
+        <w:rPr>
+          <w:rFonts w:ascii="Times New Roman" w:hAnsi="Times New Roman"/>
+          <w:b/>
+          <w:bCs/>
+          <w:color w:val="385623" w:themeColor="accent6" w:themeShade="80"/>
+          <w:sz w:val="32"/>
+          <w:szCs w:val="32"/>
+          <w:lang w:val="fr-FR"/>
+        </w:rPr>
+        <w:t xml:space="preserve"> </w:t>
+      </w:r>
+      <w:r>
+        <w:rPr>
+          <w:rFonts w:ascii="Times New Roman" w:hAnsi="Times New Roman"/>
+          <w:b/>
+          <w:bCs/>
+          <w:sz w:val="32"/>
+          <w:szCs w:val="32"/>
+          <w:lang w:val="fr-FR"/>
+        </w:rPr>
+        <w:t xml:space="preserve">au </w:t>
+      </w:r>
+      <w:r>
+        <w:rPr>
+          <w:rFonts w:ascii="Times New Roman" w:hAnsi="Times New Roman"/>
+          <w:b/>
+          <w:bCs/>
+          <w:color w:val="385623" w:themeColor="accent6" w:themeShade="80"/>
+          <w:sz w:val="32"/>
+          <w:szCs w:val="32"/>
+          <w:lang w:val="fr-FR"/>
+        </w:rPr>
+        <w:t>{{ CONTRAT_DATE_FIN }}</w:t>
+      </w:r>
+    </w:p>
+    <w:p>
+      <w:pPr>
+        <w:spacing w:line="240" w:lineRule="auto"/>
         <w:jc w:val="both"/>
-      </w:pPr>
-      <w:r>
-        <w:rPr>
-          <w:sz w:val="22"/>
-          <w:szCs w:val="22"/>
-          <w:lang w:val="fr-FR"/>
-        </w:rPr>
-        <w:t xml:space="preserve">Nous déclarons en outre avoir pris connaissance qu’une application des dispositions de l’article 93 du code de recouvrement des créances publiques, les rôles des impôts, état de produit et autres titres de perception régulièrement « mis ont exécutions contre les redevables qui y sont inscrit, toutes autres personnes auprès desquelles les redevables ont élu domicile fiscal, avec leur accord.</w:t>
-      </w:r>
-    </w:p>
-    <w:p>
-      <w:pPr>
+        <w:rPr>
+          <w:rFonts w:ascii="Times New Roman" w:hAnsi="Times New Roman"/>
+          <w:b/>
+          <w:bCs/>
+          <w:sz w:val="24"/>
+          <w:szCs w:val="24"/>
+          <w:lang w:val="fr-FR"/>
+        </w:rPr>
+      </w:pPr>
+    </w:p>
+    <w:p>
+      <w:pPr>
+        <w:spacing w:line="240" w:lineRule="auto"/>
+        <w:ind w:firstLine="720"/>
         <w:jc w:val="both"/>
-      </w:pPr>
-      <w:r>
-        <w:rPr>
-          <w:sz w:val="22"/>
-          <w:szCs w:val="22"/>
-          <w:lang w:val="fr-FR"/>
-        </w:rPr>
-        <w:t xml:space="preserve">Les personnes auprès desquelles les redevables ont élu domicile fiscal avec leur accord, peuvent, de ce fait, faire l’objet d’action en recouvrement au même titre que les redevables à raison des créances dues au titre de l’activité concerné par la durée de la domiciliation.</w:t>
-      </w:r>
-    </w:p>
-    <w:p>
-      <w:pPr>
+        <w:rPr>
+          <w:rFonts w:ascii="Times New Roman" w:hAnsi="Times New Roman"/>
+          <w:sz w:val="24"/>
+          <w:szCs w:val="24"/>
+          <w:lang w:val="fr-FR"/>
+        </w:rPr>
+      </w:pPr>
+      <w:r>
+        <w:rPr>
+          <w:rFonts w:ascii="Times New Roman" w:hAnsi="Times New Roman"/>
+          <w:sz w:val="24"/>
+          <w:szCs w:val="24"/>
+          <w:lang w:val="fr-FR"/>
+        </w:rPr>
+        <w:t>Nous déclarons en outre avoir pris connaissance qu’une application des dispositions de l’article 93 du code de recouvrement des créances publiques, les rôles des impôts, état de produit et autres titres de perception régulièrement « mis ont exécutions contre les redevables qui y sont inscrit, toutes autres personnes auprès desquelles les redevables ont élu domicile fiscal, avec leur accord.</w:t>
+      </w:r>
+    </w:p>
+    <w:p>
+      <w:pPr>
+        <w:spacing w:line="240" w:lineRule="auto"/>
+        <w:ind w:firstLine="720"/>
         <w:jc w:val="both"/>
-      </w:pPr>
-      <w:r>
-        <w:rPr>
-          <w:sz w:val="22"/>
-          <w:szCs w:val="22"/>
-          <w:lang w:val="fr-FR"/>
-        </w:rPr>
-        <w:t xml:space="preserve">Cette attestation est délivrée pour servir et valoir ce que de doit.</w:t>
-      </w:r>
-    </w:p>
-    <w:p>
-      <w:pPr>
+        <w:rPr>
+          <w:rFonts w:ascii="Times New Roman" w:hAnsi="Times New Roman"/>
+          <w:sz w:val="24"/>
+          <w:szCs w:val="24"/>
+          <w:lang w:val="fr-FR"/>
+        </w:rPr>
+      </w:pPr>
+      <w:r>
+        <w:rPr>
+          <w:rFonts w:ascii="Times New Roman" w:hAnsi="Times New Roman"/>
+          <w:sz w:val="24"/>
+          <w:szCs w:val="24"/>
+          <w:lang w:val="fr-FR"/>
+        </w:rPr>
+        <w:t>Les personnes auprès desquelles les redevables ont élu domicile fiscal avec leur accord, peuvent, de ce fait, faire l’objet d’action en recouvrement au même titre que les redevables à raison des créances dues au titre de l’activité concerné par la durée de la domiciliation.</w:t>
+      </w:r>
+    </w:p>
+    <w:p>
+      <w:pPr>
+        <w:spacing w:line="240" w:lineRule="auto"/>
+        <w:ind w:firstLine="720"/>
         <w:jc w:val="both"/>
-      </w:pPr>
-      <w:r>
-        <w:rPr>
-          <w:sz w:val="22"/>
-          <w:szCs w:val="22"/>
-          <w:lang w:val="fr-FR"/>
-        </w:rPr>
-        <w:t xml:space="preserve">Fait à Casablanca Le : </w:t>
-      </w:r>
-      <w:r>
-        <w:rPr>
-          <w:b/>
-          <w:bCs/>
-          <w:sz w:val="22"/>
-          <w:szCs w:val="22"/>
-          <w:lang w:val="fr-FR"/>
-        </w:rPr>
-        <w:t xml:space="preserve">{{ CONTRAT_DATE }}</w:t>
-      </w:r>
-    </w:p>
+        <w:rPr>
+          <w:rFonts w:ascii="Times New Roman" w:hAnsi="Times New Roman"/>
+          <w:sz w:val="24"/>
+          <w:szCs w:val="24"/>
+          <w:lang w:val="fr-FR"/>
+        </w:rPr>
+      </w:pPr>
+      <w:r>
+        <w:rPr>
+          <w:rFonts w:ascii="Times New Roman" w:hAnsi="Times New Roman"/>
+          <w:sz w:val="24"/>
+          <w:szCs w:val="24"/>
+          <w:lang w:val="fr-FR"/>
+        </w:rPr>
+        <w:t>Cette attestation est délivrée pour servir et valoir ce que de doit.</w:t>
+      </w:r>
+    </w:p>
+    <w:p>
+      <w:pPr>
+        <w:spacing w:line="240" w:lineRule="auto"/>
+        <w:jc w:val="both"/>
+        <w:rPr>
+          <w:rFonts w:ascii="Times New Roman" w:hAnsi="Times New Roman"/>
+          <w:sz w:val="24"/>
+          <w:szCs w:val="24"/>
+          <w:lang w:val="fr-FR"/>
+        </w:rPr>
+      </w:pPr>
+    </w:p>
+    <w:p>
+      <w:pPr>
+        <w:spacing w:line="240" w:lineRule="auto"/>
+        <w:jc w:val="center"/>
+        <w:rPr>
+          <w:rFonts w:ascii="Times New Roman" w:hAnsi="Times New Roman"/>
+          <w:sz w:val="24"/>
+          <w:szCs w:val="24"/>
+          <w:lang w:val="fr-FR"/>
+        </w:rPr>
+      </w:pPr>
+      <w:r>
+        <w:rPr>
+          <w:rFonts w:ascii="Times New Roman" w:hAnsi="Times New Roman"/>
+          <w:sz w:val="24"/>
+          <w:szCs w:val="24"/>
+          <w:lang w:val="fr-FR"/>
+        </w:rPr>
+        <w:t>Fait à Casablanca Le :</w:t>
+      </w:r>
+      <w:r>
+        <w:rPr>
+          <w:rFonts w:ascii="Times New Roman" w:hAnsi="Times New Roman"/>
+          <w:sz w:val="24"/>
+          <w:szCs w:val="24"/>
+          <w:lang w:val="fr-FR"/>
+        </w:rPr>
+        <w:t xml:space="preserve"> </w:t>
+      </w:r>
+      <w:r>
+        <w:rPr>
+          <w:rFonts w:ascii="Times New Roman" w:hAnsi="Times New Roman"/>
+          <w:b/>
+          <w:bCs/>
+          <w:sz w:val="24"/>
+          <w:szCs w:val="24"/>
+          <w:lang w:val="fr-FR"/>
+        </w:rPr>
+        <w:t>{{ CONTRAT_DATE }}</w:t>
+      </w:r>
+    </w:p>
+    <w:p>
+      <w:pPr>
+        <w:spacing w:line="240" w:lineRule="auto"/>
+        <w:rPr>
+          <w:rFonts w:ascii="Times New Roman" w:hAnsi="Times New Roman"/>
+          <w:sz w:val="24"/>
+          <w:szCs w:val="24"/>
+          <w:lang w:val="fr-FR"/>
+        </w:rPr>
+      </w:pPr>
+    </w:p>
+    <w:sectPr>
+      <w:pgSz w:w="11906" w:h="16838"/>
+      <w:pgMar w:top="709" w:right="1417" w:bottom="1417" w:left="1417" w:header="708" w:footer="708" w:gutter="0"/>
+      <w:cols w:space="708"/>
+      <w:docGrid w:linePitch="360"/>
+    </w:sectPr>
   </w:body>
 </w:document>
 </file>

</xml_diff>